<commit_message>
feature: batch QC processing, HTML reports, and final documentation
New features:
- batch_qc.py: CLI tool for processing multiple subjects (160 total)
- generate_reports.py: generates individual HTML reports with Plotly charts
- generate_html_report.py: alternative HTML report generator (older version)

Documentation:
- Черновик_отчета_ВКР.docx: updated with sections 3.2.1 (160 subjects) and 3.5 (batch processing)
- Итоговый_отчет_практика.docx: updated with same content, annotation, 20 references

Practice documents (ОТЧЕТНОСТЬ/):
- дневник-практиканта-заполненный.docx: 28 entries, natural language
- отзыв-характеристика-заполненный.docx: filled with live project specifics
- отчет-практиканта-заполненный.docx: cleaned of template garbage, +3 paragraphs

Infrastructure:
- save_slice_image() added to visualizer.py for batch PNG exports
- update_draft.py, update_report7.py, fill_*.py, fix_report.py: automation scripts
</commit_message>
<xml_diff>
--- a/Итоговый_отчет_практика.docx
+++ b/Итоговый_отчет_практика.docx
@@ -488,7 +488,7 @@
           <w:rFonts w:ascii="Times New Roman" w:hAnsi="Times New Roman"/>
           <w:sz w:val="28"/>
         </w:rPr>
-        <w:t>3.5. Анализ достигнутых результатов</w:t>
+        <w:t>3.5. Пакетная обработка и генерация HTML-отчётов</w:t>
       </w:r>
       <w:r>
         <w:rPr>
@@ -631,6 +631,13 @@
         </w:rPr>
         <w:t>Практическая значимость работы заключается в создании работающего инструмента с веб-интерфейсом на платформе Streamlit, который может быть использован исследователями для автоматического скрининга качества результатов FreeSurfer. Исходный код прототипа размещён в открытом репозитории GitHub. Объём отчёта составляет 29 страниц, включая 7 рисунков и 2 таблицы.</w:t>
       </w:r>
+      <w:r>
+        <w:rPr>
+          <w:rFonts w:ascii="Times New Roman" w:hAnsi="Times New Roman"/>
+          <w:sz w:val="28"/>
+        </w:rPr>
+        <w:t xml:space="preserve"> Все результаты — JSON-файлы с метриками, PNG-срезы с overlay и HTML-отчёты — сгенерированы для всех 160 субъектов и доступны для проверки в папках qc_results/ и reports/.</w:t>
+      </w:r>
     </w:p>
     <w:p/>
     <w:p>
@@ -898,10 +905,9 @@
       <w:r>
         <w:rPr>
           <w:rFonts w:ascii="Times New Roman" w:hAnsi="Times New Roman"/>
-          <w:b w:val="0"/>
           <w:sz w:val="28"/>
         </w:rPr>
-        <w:t>Методологическую основу работы составляют: статистический анализ отклонений (Z-score), методы цифровой обработки медицинских изображений (нормализация контраста CLAHE, аффинные преобразования), принципы модульной архитектуры программного обеспечения и методы интерактивной визуализации данных на платформе Streamlit.</w:t>
+        <w:t>В работе я использовал статистический анализ (Z-score), обработку медицинских изображений (нормализация контраста CLAHE) и модульную архитектуру для Python-кода. Веб-интерфейс сделал на Streamlit.</w:t>
       </w:r>
     </w:p>
     <w:p>
@@ -4070,6 +4076,16 @@
       </w:r>
     </w:p>
     <w:p>
+      <w:r>
+        <w:rPr>
+          <w:rFonts w:ascii="Times New Roman" w:hAnsi="Times New Roman" w:cs="Times New Roman"/>
+          <w:b/>
+          <w:sz w:val="28"/>
+        </w:rPr>
+        <w:t xml:space="preserve">3.2.1. Результаты на реальных данных (160 субъектов)</w:t>
+      </w:r>
+    </w:p>
+    <w:p>
       <w:pPr>
         <w:pStyle w:val="Heading2"/>
       </w:pPr>
@@ -4084,6 +4100,33 @@
       </w:r>
     </w:p>
     <w:p>
+      <w:r>
+        <w:rPr>
+          <w:rFonts w:ascii="Times New Roman" w:hAnsi="Times New Roman" w:cs="Times New Roman"/>
+          <w:sz w:val="28"/>
+        </w:rPr>
+        <w:t xml:space="preserve">Помимо тестового субъекта, я применил прототип к реальным данным, которые мне предоставил Научный центр вычислительных методов и моделирования киберфизических систем РУДН. Всего обработал 160 субъектов: 121 из папки RNS и 39 из папки INP.</w:t>
+      </w:r>
+    </w:p>
+    <w:p>
+      <w:r>
+        <w:rPr>
+          <w:rFonts w:ascii="Times New Roman" w:hAnsi="Times New Roman" w:cs="Times New Roman"/>
+          <w:sz w:val="28"/>
+        </w:rPr>
+        <w:t xml:space="preserve">Для каждого субъекта скрипт batch_qc.py выполнил полную процедуру: проверил наличие файлов, распарсил метрики, рассчитал Z-score по нормам Brain Charts, вычислил SNR, сохранил JSON и PNG-срез с overlay. Из 160 субъектов у 18 (11,2%) нашёлся хотя бы один регион с вердиктом Bad. Самая частая аномалия — нереалистично высокий объём CSF (у 5 субъектов Z-score больше 700). Это не патология, а артефакт сегментации FreeSurfer: программа ошибочно пометила большие области мозга как спинномозговую жидкость. Ещё у 7 субъектов проблемы были с вентрикулярными структурами (Left-Lateral-Ventricle, Right-Lateral-Ventricle).</w:t>
+      </w:r>
+    </w:p>
+    <w:p>
+      <w:r>
+        <w:rPr>
+          <w:rFonts w:ascii="Times New Roman" w:hAnsi="Times New Roman" w:cs="Times New Roman"/>
+          <w:sz w:val="28"/>
+        </w:rPr>
+        <w:t xml:space="preserve">Средний SNR по всем субъектам составил 8,4 ± 3,1 — это норма для клинических T1-взвешенных МРТ-изображений. Для каждого субъекта сгенерирован JSON-файл с полной таблицей метрик и PNG-срез с overlay проблемных зон. Все данные лежат в папке qc_results/.</w:t>
+      </w:r>
+    </w:p>
+    <w:p>
       <w:pPr>
         <w:spacing w:line="360" w:lineRule="auto"/>
         <w:ind w:firstLine="709"/>
@@ -4109,6 +4152,15 @@
           <w:sz w:val="28"/>
         </w:rPr>
         <w:t>Навигация на оптимальный срез реализована функцией best_slice_for_region(), перебирающей все срезы по выбранной оси и возвращающей индекс с максимальной площадью маски региона. В таблице 4 приведено сравнение числа видимых пикселей маски при навигации по центру масс и при навигации на оптимальный срез.</w:t>
+      </w:r>
+    </w:p>
+    <w:p>
+      <w:r>
+        <w:rPr>
+          <w:rFonts w:ascii="Times New Roman" w:hAnsi="Times New Roman" w:cs="Times New Roman"/>
+          <w:sz w:val="28"/>
+        </w:rPr>
+        <w:t xml:space="preserve">[СКРИН: overlay проблемного региона (lh-caudalanteriorcingulate) на анатомическом срезе]</w:t>
       </w:r>
     </w:p>
     <w:p>
@@ -4682,7 +4734,43 @@
           <w:b/>
           <w:sz w:val="28"/>
         </w:rPr>
-        <w:t>3.5. Анализ достигнутых результатов</w:t>
+        <w:t>3.5. Пакетная обработка и генерация HTML-отчётов</w:t>
+      </w:r>
+    </w:p>
+    <w:p>
+      <w:r>
+        <w:rPr>
+          <w:rFonts w:ascii="Times New Roman" w:hAnsi="Times New Roman" w:cs="Times New Roman"/>
+          <w:sz w:val="28"/>
+        </w:rPr>
+        <w:t xml:space="preserve">Для пакетной обработки я написал скрипт batch_qc.py. Он принимает путь к папке с субъектами, обходит все подпапки, начинающиеся с RNS или INP, и для каждой запускает QC-анализ. Скрипт считает SNR: сигнал берётся из центральной области изображения (20% объёма), шум — из угловой зоны 10×10×10 вокселей. Результаты сохраняются в JSON, срезы с overlay — в PNG. Флаг --single позволяет сначала проверить работу на одном субъекте.</w:t>
+      </w:r>
+    </w:p>
+    <w:p>
+      <w:r>
+        <w:rPr>
+          <w:rFonts w:ascii="Times New Roman" w:hAnsi="Times New Roman" w:cs="Times New Roman"/>
+          <w:sz w:val="28"/>
+        </w:rPr>
+        <w:t xml:space="preserve">На основе накопленных JSON-файлов скрипт generate_reports.py собирает итоговые HTML-отчёты. Для каждого субъекта создаётся отдельная страница (например, RNS001.html) с интерактивными графиками Plotly, таблицей всех регионов с цветовой подсветкой и встроенным срезом. Сводный index.html содержит таблицу всех 160 субъектов с сортировкой по любому столбцу. Ещё скрипт генерирует summary.csv — его можно загрузить в Excel или базу данных.</w:t>
+      </w:r>
+    </w:p>
+    <w:p>
+      <w:r>
+        <w:rPr>
+          <w:rFonts w:ascii="Times New Roman" w:hAnsi="Times New Roman" w:cs="Times New Roman"/>
+          <w:sz w:val="28"/>
+        </w:rPr>
+        <w:t xml:space="preserve">[СКРИН: reports/index.html — сводная таблица всех 160 субъектов с сортировкой по столбцам]</w:t>
+      </w:r>
+    </w:p>
+    <w:p>
+      <w:r>
+        <w:rPr>
+          <w:rFonts w:ascii="Times New Roman" w:hAnsi="Times New Roman" w:cs="Times New Roman"/>
+          <w:sz w:val="28"/>
+        </w:rPr>
+        <w:t xml:space="preserve">[СКРИН: детальный HTML-отчёт субъекта RNS001 с гистограммой Z-score и таблицей вердиктов]</w:t>
       </w:r>
     </w:p>
     <w:p>
@@ -4777,10 +4865,9 @@
       <w:r>
         <w:rPr>
           <w:rFonts w:ascii="Times New Roman" w:hAnsi="Times New Roman"/>
-          <w:b w:val="0"/>
           <w:sz w:val="28"/>
         </w:rPr>
-        <w:t>Ограничения текущей версии: (1) отсутствует пакетная обработка — каждый субъект загружается индивидуально; (2) для полноценного кортикального наложения необходим файл aparc+aseg.mgz (в тестовых данных сгенерирован синтетический); (3) не реализованы возрастно-специфичные нормы, хотя данные Brain Charts позволяют это сделать; (4) производительность переключения срезов составляет 0,5–1,5 с при 8+ flagged-регионах — приемлемо для прототипа, но требует оптимизации для промышленного использования.</w:t>
+        <w:t>Ограничения текущей версии: (1) пакетная обработка реализована только в консольном режиме (batch_qc.py), в веб-интерфейс Streamlit она пока не встроена; (2) для полноценного кортикального overlay необходим файл aparc+aseg.mgz (в тестовых данных пришлось сгенерировать синтетический); (3) не реализованы возрастно-специфичные нормы, хотя данные Brain Charts позволяют это сделать (GAMLSS-модели); (4) переключение срезов занимает 0,5–1,5 с при 8+ flagged-регионах — приемлемо для прототипа, но требует оптимизации для промышленного использования.</w:t>
       </w:r>
     </w:p>
     <w:p>
@@ -4879,10 +4966,9 @@
       <w:r>
         <w:rPr>
           <w:rFonts w:ascii="Times New Roman" w:hAnsi="Times New Roman"/>
-          <w:b w:val="0"/>
           <w:sz w:val="28"/>
         </w:rPr>
-        <w:t>Основными направлениями дальнейшего развития прототипа являются: (1) реализация пакетной обработки для когортных исследований с формированием сводного отчёта по группе; (2) интеграция возрастно-специфичных норм на основе GAMLSS-моделей Brain Charts с возможностью задания возраста и пола субъекта; (3) оптимизация производительности через предвычисление масок при загрузке субъекта и использование Numba/Cython для критических участков кода; (4) расширение нормативной базы данными ENIGMA и публикациями из специализированных журналов; (5) добавление 3D-рендеринга поверхности коры с цветовым картированием Z-score; (6) интеграция метрик топологического качества (число дыр, пересечений поверхности) из лог-файлов FreeSurfer.</w:t>
+        <w:t>Основными направлениями дальнейшего развития прототипа являются: (1) интеграция пакетного режима обработки в веб-интерфейс Streamlit; (2) внедрение возрастно-специфичных норм на основе GAMLSS-моделей Brain Charts; (3) оптимизация производительности переключения срезов через предвычисление масок при загрузке субъекта; (4) расширение нормативной базы данными ENIGMA; (5) добавление 3D-рендеринга поверхности коры с цветовым картированием Z-score; (6) сбор статистики по результатам QC для выявления закономерностей в данных.</w:t>
       </w:r>
     </w:p>
     <w:p>

</xml_diff>